<commit_message>
created Trading Mandate Addendum
</commit_message>
<xml_diff>
--- a/docs/FSCA Compliance/BitWealth_LTH_PVR_Client_Addendum_v1.docx
+++ b/docs/FSCA Compliance/BitWealth_LTH_PVR_Client_Addendum_v1.docx
@@ -112,6 +112,23 @@
     </w:p>
     <w:p>
       <w:pPr>
+        <w:spacing w:before="0" w:after="120"/>
+        <w:jc w:val="both"/>
+      </w:pPr>
+      <w:r>
+        <w:rPr>
+          <w:rFonts w:ascii="Calibri" w:hAnsi="Calibri"/>
+          <w:b w:val="0"/>
+          <w:i w:val="0"/>
+          <w:color w:val="1A1A1A"/>
+          <w:sz w:val="20"/>
+          <w:u w:val="none"/>
+        </w:rPr>
+        <w:t>BitWealth Asset Managers (Pty) Ltd (“BitWealth”), a Juristic Representative of Finova (PTY) Ltd (FSP No. 21095), offers a proprietary Bitcoin investment management service known as the BitWealth Bitcoin LTH PVR Strategy (“the Strategy”). The Strategy combines three core components — an on-chain signal layer, a dollar-cost averaging accumulation framework, and a dynamic grid execution engine — into a single, fully-automated Bitcoin allocation engine. An optional fourth component (idle-cash yield via USDPC) is available and must be explicitly opted into. The Strategy is executed entirely on the VALR exchange within a segregated, dedicated client sub-account. No cross-border transfer of funds or forex externalization is required.</w:t>
+      </w:r>
+    </w:p>
+    <w:p>
+      <w:pPr>
         <w:keepNext/>
         <w:spacing w:before="160" w:after="40"/>
       </w:pPr>
@@ -123,6 +140,21 @@
           <w:sz w:val="20"/>
         </w:rPr>
         <w:t>The Strategy — How it Works</w:t>
+      </w:r>
+    </w:p>
+    <w:p>
+      <w:pPr>
+        <w:keepNext/>
+        <w:spacing w:before="80" w:after="40"/>
+      </w:pPr>
+      <w:r>
+        <w:rPr>
+          <w:rFonts w:ascii="Calibri" w:hAnsi="Calibri"/>
+          <w:b/>
+          <w:color w:val="1A1A1A"/>
+          <w:sz w:val="20"/>
+        </w:rPr>
+        <w:t>Component 1: The LTH PVR On-Chain Signal</w:t>
       </w:r>
     </w:p>
     <w:p>
@@ -139,7 +171,7 @@
           <w:sz w:val="20"/>
           <w:u w:val="none"/>
         </w:rPr>
-        <w:t>The Strategy is based on the Long-Term Holder Price Variance Ratio (LTH PVR), a proprietary on-chain analytical model. The LTH PVR measures the deviation between the current Bitcoin market price and the average acquisition cost (cost basis) of long-term Bitcoin holders — defined as holders who have not moved their Bitcoin for 155 days or more. This metric provides a signal of whether Bitcoin is statistically undervalued or overvalued relative to its most committed holders.</w:t>
+        <w:t>The core signal of the Strategy is the Long-Term Holder Profit-to-Volatility Ratio (“LTH PVR”), a proprietary on-chain analytical metric. It measures the deviation between the current Bitcoin market price and the average acquisition cost (realised price) of Bitcoin’s long-term holders — defined as holders who have not moved their coins for 155 days or more. This cohort, often called the “smart money” of the Bitcoin network, represents over 70% of circulating supply and reflects the conviction of the most committed participants in the market.</w:t>
       </w:r>
     </w:p>
     <w:p>
@@ -156,55 +188,22 @@
           <w:sz w:val="20"/>
           <w:u w:val="none"/>
         </w:rPr>
-        <w:t>The algorithm generates a daily signal that determines one of three actions:</w:t>
+        <w:t>The deviation of price from the LTH realised price is normalised by the rolling volatility of that cohort’s cost basis and expressed in standard deviations (σ) from its historical mean. A negative σ reading indicates Bitcoin is statistically cheap relative to what long-term holders paid; a positive σ reading indicates it is expensive. Because LTH realised price is computed directly from blockchain UTXO data, the signal reflects actual economic conviction — it cannot be manipulated by short-term flows, derivative positioning, or sentiment.</w:t>
       </w:r>
     </w:p>
     <w:p>
       <w:pPr>
-        <w:pStyle w:val="ListBullet"/>
-        <w:spacing w:before="20" w:after="60"/>
-        <w:ind w:left="454"/>
-        <w:jc w:val="both"/>
+        <w:keepNext/>
+        <w:spacing w:before="80" w:after="40"/>
       </w:pPr>
       <w:r>
         <w:rPr>
           <w:rFonts w:ascii="Calibri" w:hAnsi="Calibri"/>
+          <w:b/>
           <w:color w:val="1A1A1A"/>
           <w:sz w:val="20"/>
         </w:rPr>
-        <w:t>BUY — when the LTH PVR indicates that Bitcoin is trading at a significant discount relative to long-term holder cost basis (signal: accumulate);</w:t>
-      </w:r>
-    </w:p>
-    <w:p>
-      <w:pPr>
-        <w:pStyle w:val="ListBullet"/>
-        <w:spacing w:before="20" w:after="60"/>
-        <w:ind w:left="454"/>
-        <w:jc w:val="both"/>
-      </w:pPr>
-      <w:r>
-        <w:rPr>
-          <w:rFonts w:ascii="Calibri" w:hAnsi="Calibri"/>
-          <w:color w:val="1A1A1A"/>
-          <w:sz w:val="20"/>
-        </w:rPr>
-        <w:t>SELL / REDUCE — when the LTH PVR indicates that Bitcoin is trading at a significant premium relative to long-term holder cost basis (signal: reduce exposure);</w:t>
-      </w:r>
-    </w:p>
-    <w:p>
-      <w:pPr>
-        <w:pStyle w:val="ListBullet"/>
-        <w:spacing w:before="20" w:after="60"/>
-        <w:ind w:left="454"/>
-        <w:jc w:val="both"/>
-      </w:pPr>
-      <w:r>
-        <w:rPr>
-          <w:rFonts w:ascii="Calibri" w:hAnsi="Calibri"/>
-          <w:color w:val="1A1A1A"/>
-          <w:sz w:val="20"/>
-        </w:rPr>
-        <w:t>HOLD — when the LTH PVR indicates a neutral zone (no trade is executed).</w:t>
+        <w:t>Component 2: Dollar-Cost Averaging (DCA)</w:t>
       </w:r>
     </w:p>
     <w:p>
@@ -221,7 +220,22 @@
           <w:sz w:val="20"/>
           <w:u w:val="none"/>
         </w:rPr>
-        <w:t>Trades are executed as LIMIT orders on the VALR exchange. If a limit order is not filled within 5 minutes, it is automatically cancelled and replaced with a MARKET order to ensure execution. The Client’s assets are held at all times in a segregated, dedicated sub-account on VALR — BitWealth does not hold or receive client funds.</w:t>
+        <w:t>The Strategy commits the client’s regular contributions to Bitcoin at a disciplined cadence regardless of short-term market conditions. By spreading entries over time, DCA eliminates the single largest risk in volatile assets: the timing of a lump-sum entry. Average cost converges to the mean traded price over the contribution window, not to whatever price prevailed on any one day. The accumulation is fully automated; the client does not need to monitor the market or make day-to-day decisions.</w:t>
+      </w:r>
+    </w:p>
+    <w:p>
+      <w:pPr>
+        <w:keepNext/>
+        <w:spacing w:before="80" w:after="40"/>
+      </w:pPr>
+      <w:r>
+        <w:rPr>
+          <w:rFonts w:ascii="Calibri" w:hAnsi="Calibri"/>
+          <w:b/>
+          <w:color w:val="1A1A1A"/>
+          <w:sz w:val="20"/>
+        </w:rPr>
+        <w:t>Component 3: Dynamic Grid Execution</w:t>
       </w:r>
     </w:p>
     <w:p>
@@ -238,7 +252,59 @@
           <w:sz w:val="20"/>
           <w:u w:val="none"/>
         </w:rPr>
-        <w:t>The Strategy may be funded by a once-off lump-sum investment of at least R 50 000 (Fifty Thousand Rand), and / or a recurring monthly DCA contribution of at least R 500 per month. Withdrawals may be requested at any time with 5 (five) business days’ written notice.</w:t>
+        <w:t>The LTH PVR signal feeds a dynamic grid engine that determines how much Bitcoin to buy or sell on any given day. The Strategy uses an eleven-band confidence-interval framework: eleven grid levels are drawn as σ bands around the daily LTH PVR mean, with buy orders becoming progressively larger as the signal moves deeper into statistically cheap territory (∞2σ or lower) and sell orders becoming progressively larger as it moves into overheated territory (+2σ or higher). Unlike a traditional static grid bot — whose fixed price levels quickly become stranded in a trending market — the sigma bands recalibrate automatically every day as the on-chain mean drifts, ensuring orders always fire relative to current market conditions.</w:t>
+      </w:r>
+    </w:p>
+    <w:p>
+      <w:pPr>
+        <w:spacing w:before="40" w:after="80"/>
+        <w:jc w:val="both"/>
+      </w:pPr>
+      <w:r>
+        <w:rPr>
+          <w:rFonts w:ascii="Calibri" w:hAnsi="Calibri"/>
+          <w:b w:val="0"/>
+          <w:i w:val="0"/>
+          <w:color w:val="1A1A1A"/>
+          <w:sz w:val="20"/>
+          <w:u w:val="none"/>
+        </w:rPr>
+        <w:t>The grid also includes a Bear Market Pause: when momentum indicators confirm a sustained downtrend, the engine suspends new buy orders until conditions stabilise, protecting against deploying capital into a persistent decline.</w:t>
+      </w:r>
+    </w:p>
+    <w:p>
+      <w:pPr>
+        <w:spacing w:before="40" w:after="80"/>
+        <w:jc w:val="both"/>
+      </w:pPr>
+      <w:r>
+        <w:rPr>
+          <w:rFonts w:ascii="Calibri" w:hAnsi="Calibri"/>
+          <w:b w:val="0"/>
+          <w:i w:val="0"/>
+          <w:color w:val="1A1A1A"/>
+          <w:sz w:val="20"/>
+          <w:u w:val="none"/>
+        </w:rPr>
+        <w:t>All orders are placed as LIMIT orders on the VALR exchange. If a limit order is not filled within 5 minutes, it is automatically cancelled and replaced with a MARKET order to ensure execution. The client’s assets are held at all times in a segregated, dedicated VALR sub-account; BitWealth does not receive or hold client funds.</w:t>
+      </w:r>
+    </w:p>
+    <w:p>
+      <w:pPr>
+        <w:spacing w:before="40" w:after="80"/>
+        <w:jc w:val="both"/>
+      </w:pPr>
+      <w:r>
+        <w:rPr>
+          <w:rFonts w:ascii="Calibri" w:hAnsi="Calibri"/>
+          <w:b w:val="0"/>
+          <w:i w:val="0"/>
+          <w:color w:val="1A1A1A"/>
+          <w:sz w:val="20"/>
+          <w:u w:val="none"/>
+        </w:rPr>
+        <w:t>The Strategy may be funded by a once-off lump-sum of at least R +50 000 and / or a recurring monthly DCA contribution of at least R 5 000 per month. Withdrawals may be requested at any time with 5 (five) business days’ written notice.</w:t>
       </w:r>
     </w:p>
     <w:p>
@@ -318,6 +384,185 @@
           <w:color w:val="1A1A1A"/>
           <w:sz w:val="20"/>
         </w:rPr>
+        <w:t>Optional Component 4: Idle-Cash Yield via USDPC</w:t>
+      </w:r>
+    </w:p>
+    <w:p>
+      <w:pPr>
+        <w:spacing w:before="40" w:after="80"/>
+        <w:jc w:val="both"/>
+      </w:pPr>
+      <w:r>
+        <w:rPr>
+          <w:rFonts w:ascii="Calibri" w:hAnsi="Calibri"/>
+          <w:b w:val="0"/>
+          <w:i w:val="0"/>
+          <w:color w:val="1A1A1A"/>
+          <w:sz w:val="20"/>
+          <w:u w:val="none"/>
+        </w:rPr>
+        <w:t>Between Bitcoin positions — during HOLD periods and the Bear Market Pause — the client’s portfolio may hold a material balance of idle USDT. By default this cash earns no return. BitWealth offers an optional enhancement: idle USDT can be automatically swept into USDPC, the USD Private Credit Token issued by RainFin (Pty) Ltd, backed by the Garrington Private Credit Strategy — a portfolio of senior secured, asset-backed loans with a 10-year track record.</w:t>
+      </w:r>
+    </w:p>
+    <w:p>
+      <w:pPr>
+        <w:spacing w:before="40" w:after="80"/>
+        <w:jc w:val="both"/>
+      </w:pPr>
+      <w:r>
+        <w:rPr>
+          <w:rFonts w:ascii="Calibri" w:hAnsi="Calibri"/>
+          <w:b w:val="0"/>
+          <w:i w:val="0"/>
+          <w:color w:val="1A1A1A"/>
+          <w:sz w:val="20"/>
+          <w:u w:val="none"/>
+        </w:rPr>
+        <w:t>USDPC targets a net USD return of approximately 8–10% per annum. The sweep is fully automated and designed never to delay a Bitcoin trade: the instant the LTH PVR engine generates a buy signal, any USDPC balance is converted back to USDT (sub-second settlement) before the order is placed. Each conversion costs approximately 0.1% of the amount swept. This feature is OPTIONAL and disabled by default.</w:t>
+      </w:r>
+    </w:p>
+    <w:tbl>
+      <w:tblPr>
+        <w:tblStyle w:val="TableGrid"/>
+        <w:tblW w:type="auto" w:w="0"/>
+        <w:jc w:val="left"/>
+        <w:tblLook w:firstColumn="1" w:firstRow="1" w:lastColumn="0" w:lastRow="0" w:noHBand="0" w:noVBand="1" w:val="04A0"/>
+      </w:tblPr>
+      <w:tblGrid>
+        <w:gridCol w:w="567"/>
+        <w:gridCol w:w="8504"/>
+      </w:tblGrid>
+      <w:tr>
+        <w:tc>
+          <w:tcPr>
+            <w:tcW w:type="dxa" w:w="4873"/>
+            <w:shd w:val="clear" w:color="auto" w:fill="FFFDE7"/>
+          </w:tcPr>
+          <w:p>
+            <w:pPr>
+              <w:jc w:val="center"/>
+            </w:pPr>
+            <w:r>
+              <w:rPr>
+                <w:rFonts w:ascii="Calibri" w:hAnsi="Calibri"/>
+                <w:color w:val="173F5F"/>
+                <w:sz w:val="32"/>
+              </w:rPr>
+              <w:t>☐</w:t>
+            </w:r>
+          </w:p>
+        </w:tc>
+        <w:tc>
+          <w:tcPr>
+            <w:tcW w:type="dxa" w:w="4873"/>
+            <w:shd w:val="clear" w:color="auto" w:fill="FFFDE7"/>
+          </w:tcPr>
+          <w:p>
+            <w:r>
+              <w:rPr>
+                <w:rFonts w:ascii="Calibri" w:hAnsi="Calibri"/>
+                <w:color w:val="1A1A1A"/>
+                <w:sz w:val="20"/>
+              </w:rPr>
+              <w:t>I / We opt IN to the USDPC idle-cash yield feature (Optional Component 4). I / We acknowledge the USDPC-specific risks listed below and agree that idle USDT in my / our portfolio may be automatically swept into USDPC between Bitcoin positions.   Client initials: __________</w:t>
+            </w:r>
+          </w:p>
+        </w:tc>
+      </w:tr>
+    </w:tbl>
+    <w:p>
+      <w:pPr>
+        <w:spacing w:before="120" w:after="40"/>
+        <w:jc w:val="both"/>
+      </w:pPr>
+      <w:r>
+        <w:rPr>
+          <w:rFonts w:ascii="Calibri" w:hAnsi="Calibri"/>
+          <w:b w:val="0"/>
+          <w:i w:val="0"/>
+          <w:color w:val="1A1A1A"/>
+          <w:sz w:val="20"/>
+          <w:u w:val="none"/>
+        </w:rPr>
+        <w:t>USDPC-specific risks (applicable only if opted in above):</w:t>
+      </w:r>
+    </w:p>
+    <w:p>
+      <w:pPr>
+        <w:pStyle w:val="ListBullet"/>
+        <w:spacing w:before="20" w:after="60"/>
+        <w:ind w:left="454"/>
+        <w:jc w:val="both"/>
+      </w:pPr>
+      <w:r>
+        <w:rPr>
+          <w:rFonts w:ascii="Calibri" w:hAnsi="Calibri"/>
+          <w:color w:val="1A1A1A"/>
+          <w:sz w:val="20"/>
+        </w:rPr>
+        <w:t>USDPC is NOT a bank deposit and is not protected by the Deposit Insurance Scheme. The 8–10% per annum target return is not guaranteed and may vary.</w:t>
+      </w:r>
+    </w:p>
+    <w:p>
+      <w:pPr>
+        <w:pStyle w:val="ListBullet"/>
+        <w:spacing w:before="20" w:after="60"/>
+        <w:ind w:left="454"/>
+        <w:jc w:val="both"/>
+      </w:pPr>
+      <w:r>
+        <w:rPr>
+          <w:rFonts w:ascii="Calibri" w:hAnsi="Calibri"/>
+          <w:color w:val="1A1A1A"/>
+          <w:sz w:val="20"/>
+        </w:rPr>
+        <w:t>The client is exposed to credit risk (borrower default within the Garrington Private Credit portfolio), liquidity risk (redemption delays in certain conditions), and smart-contract / technology risk associated with the USDPC token.</w:t>
+      </w:r>
+    </w:p>
+    <w:p>
+      <w:pPr>
+        <w:pStyle w:val="ListBullet"/>
+        <w:spacing w:before="20" w:after="60"/>
+        <w:ind w:left="454"/>
+        <w:jc w:val="both"/>
+      </w:pPr>
+      <w:r>
+        <w:rPr>
+          <w:rFonts w:ascii="Calibri" w:hAnsi="Calibri"/>
+          <w:color w:val="1A1A1A"/>
+          <w:sz w:val="20"/>
+        </w:rPr>
+        <w:t>USDPC is a third-party product issued by RainFin (Pty) Ltd. BitWealth and Finova are not responsible for the performance, solvency, or continued operation of RainFin or the Garrington Private Credit Strategy.</w:t>
+      </w:r>
+    </w:p>
+    <w:p>
+      <w:pPr>
+        <w:pStyle w:val="ListBullet"/>
+        <w:spacing w:before="20" w:after="60"/>
+        <w:ind w:left="454"/>
+        <w:jc w:val="both"/>
+      </w:pPr>
+      <w:r>
+        <w:rPr>
+          <w:rFonts w:ascii="Calibri" w:hAnsi="Calibri"/>
+          <w:color w:val="1A1A1A"/>
+          <w:sz w:val="20"/>
+        </w:rPr>
+        <w:t>Each automated USDT⇔USDPC conversion costs approximately 0.1% of the amount swept. These costs are for the client’s account.</w:t>
+      </w:r>
+    </w:p>
+    <w:p>
+      <w:pPr>
+        <w:keepNext/>
+        <w:spacing w:before="160" w:after="40"/>
+      </w:pPr>
+      <w:r>
+        <w:rPr>
+          <w:rFonts w:ascii="Calibri" w:hAnsi="Calibri"/>
+          <w:b/>
+          <w:color w:val="1A1A1A"/>
+          <w:sz w:val="20"/>
+        </w:rPr>
         <w:t>Risks</w:t>
       </w:r>
     </w:p>
@@ -335,7 +580,7 @@
           <w:sz w:val="20"/>
           <w:u w:val="none"/>
         </w:rPr>
-        <w:t>Bitcoin is a high-risk, highly volatile asset. Past or back-tested performance of the LTH PVR Strategy is not a guarantee of future results. The Client acknowledges the following risks, which are not exhaustive:</w:t>
+        <w:t>Bitcoin is a high-risk, highly volatile asset. Past or back-tested performance of the LTH PVR Strategy is not a guarantee of future results. The client acknowledges the following risks, which are not exhaustive:</w:t>
       </w:r>
     </w:p>
     <w:p>
@@ -351,7 +596,7 @@
           <w:color w:val="1A1A1A"/>
           <w:sz w:val="20"/>
         </w:rPr>
-        <w:t>Bitcoin price may decline sharply and rapidly. The Client may receive back less than the amount invested.</w:t>
+        <w:t>Bitcoin price may decline sharply and rapidly. The client may receive back less than the amount invested.</w:t>
       </w:r>
     </w:p>
     <w:p>
@@ -367,7 +612,7 @@
           <w:color w:val="1A1A1A"/>
           <w:sz w:val="20"/>
         </w:rPr>
-        <w:t>The LTH PVR algorithm is based on on-chain data sourced from a third-party data provider (Research Bitcoin). Inaccurate, delayed, or unavailable data may cause incorrect signals or missed trades.</w:t>
+        <w:t>The LTH PVR algorithm uses on-chain data sourced from Research Bitcoin, a third-party data provider. Inaccurate, delayed, or unavailable data may cause incorrect signals or missed trades.</w:t>
       </w:r>
     </w:p>
     <w:p>
@@ -383,7 +628,7 @@
           <w:color w:val="1A1A1A"/>
           <w:sz w:val="20"/>
         </w:rPr>
-        <w:t>All trades are executed on the VALR exchange. The Client is exposed to exchange operational risk, including downtime, technical failure, and counterparty risk.</w:t>
+        <w:t>All trades are executed on the VALR exchange. The client is exposed to exchange operational risk, including downtime, technical failure, and counterparty risk.</w:t>
       </w:r>
     </w:p>
     <w:p>
@@ -399,7 +644,7 @@
           <w:color w:val="1A1A1A"/>
           <w:sz w:val="20"/>
         </w:rPr>
-        <w:t>Bitcoin is a relatively new asset class. South African and international regulatory frameworks governing crypto assets are evolving. Future regulatory changes may affect the operation of the Strategy, the VALR exchange, or the Client’s access to their assets.</w:t>
+        <w:t>Bitcoin is a relatively new asset class. Regulatory frameworks governing crypto assets are evolving. Future changes may affect the Strategy, VALR, or the client’s access to their assets.</w:t>
       </w:r>
     </w:p>
     <w:p>
@@ -415,7 +660,7 @@
           <w:color w:val="1A1A1A"/>
           <w:sz w:val="20"/>
         </w:rPr>
-        <w:t>The Client’s assets are held in a VALR sub-account. VALR is a licensed crypto asset service provider in South Africa, but client assets held on an exchange are not covered by the Investor Protection Compensation Scheme applicable to traditional securities.</w:t>
+        <w:t>Client assets are held in a VALR sub-account. VALR is a licensed crypto asset service provider, but assets held on an exchange are not covered by the Investor Protection Compensation Scheme applicable to traditional securities.</w:t>
       </w:r>
     </w:p>
     <w:p>
@@ -431,7 +676,23 @@
           <w:color w:val="1A1A1A"/>
           <w:sz w:val="20"/>
         </w:rPr>
-        <w:t>No warranties, guarantees or representations regarding returns are made. The Client should consider the appropriateness of this Strategy for their personal financial circumstances before investing.</w:t>
+        <w:t>The Dynamic Grid and Bear Market Pause features reduce but do not eliminate the risk of loss during sustained bear markets or extreme volatility events.</w:t>
+      </w:r>
+    </w:p>
+    <w:p>
+      <w:pPr>
+        <w:pStyle w:val="ListBullet"/>
+        <w:spacing w:before="20" w:after="60"/>
+        <w:ind w:left="454"/>
+        <w:jc w:val="both"/>
+      </w:pPr>
+      <w:r>
+        <w:rPr>
+          <w:rFonts w:ascii="Calibri" w:hAnsi="Calibri"/>
+          <w:color w:val="1A1A1A"/>
+          <w:sz w:val="20"/>
+        </w:rPr>
+        <w:t>No warranties, guarantees or representations regarding returns are made. The client should consider the appropriateness of this Strategy for their personal financial circumstances before investing.</w:t>
       </w:r>
     </w:p>
     <w:p>
@@ -463,7 +724,7 @@
           <w:sz w:val="20"/>
           <w:u w:val="none"/>
         </w:rPr>
-        <w:t>The following fees apply to the Strategy. Applicable rates are as agreed between the Client and BitWealth and recorded in the Client’s individual fee schedule:</w:t>
+        <w:t>The following fees apply. Applicable rates are agreed between the client and BitWealth and recorded in the client’s individual fee schedule.</w:t>
       </w:r>
     </w:p>
     <w:p>
@@ -489,7 +750,7 @@
           <w:color w:val="1A1A1A"/>
           <w:sz w:val="20"/>
         </w:rPr>
-        <w:t xml:space="preserve">[●]% of net profits above the High-Water Mark, calculated and deducted </w:t>
+        <w:t xml:space="preserve">[●]% of net profits above the HWM, calculated and deducted </w:t>
       </w:r>
       <w:r>
         <w:rPr>
@@ -509,7 +770,7 @@
           <w:color w:val="1A1A1A"/>
           <w:sz w:val="20"/>
         </w:rPr>
-        <w:t xml:space="preserve">. </w:t>
+        <w:t>. Standard rate: 10%.</w:t>
       </w:r>
     </w:p>
     <w:p>
@@ -526,7 +787,7 @@
           <w:sz w:val="20"/>
           <w:u w:val="none"/>
         </w:rPr>
-        <w:t>The High-Water Mark (HWM) is the highest net asset value (NAV) that the Client’s portfolio has previously achieved. Performance fees are charged only on new net profits that exceed this highest point. If the portfolio value falls and subsequently recovers, performance fees are charged only on the recovery above the previous high — not on the full portfolio value. This ensures the Client never pays performance fees on the same gains twice.</w:t>
+        <w:t>The HWM is the highest NAV the client’s portfolio has previously achieved. Performance fees are charged only on new profits above that mark. If the portfolio falls and recovers, no fee is charged on the recovery — only on gains that set a new high. Example: NAV reaches $100k, drops to $80k, recovers to $100k (no fee), then grows to $120k — fee charged on $20k of new profit only.</w:t>
       </w:r>
     </w:p>
     <w:p>
@@ -552,7 +813,7 @@
           <w:color w:val="1A1A1A"/>
           <w:sz w:val="20"/>
         </w:rPr>
-        <w:t>[●]% per annum of the average portfolio value, calculated monthly and deducted from the portfolio at month-end. The management fee is charged regardless of portfolio performance.</w:t>
+        <w:t>[●]% per annum on portfolio NAV, calculated and deducted monthly. Standard rate: 1% p.a. (≈20.83 basis points per month on average NAV).</w:t>
       </w:r>
     </w:p>
     <w:p>
@@ -569,7 +830,50 @@
           <w:sz w:val="20"/>
           <w:u w:val="none"/>
         </w:rPr>
-        <w:t>Exchange fees charged by VALR on each trade are for the Client’s account. BitWealth receives a revenue share from VALR in respect of exchange fees and this does not result in any additional charge to the Client.</w:t>
+        <w:t>Exchange fees (VALR): approximately 8 basis points (0.08%) per BTC/USDT trade and 18 basis points (0.18%) per ZAR/USDT conversion. These are for the client’s account. BitWealth receives a revenue-share from VALR which does not result in any additional charge to the client.</w:t>
+      </w:r>
+    </w:p>
+    <w:p>
+      <w:pPr>
+        <w:spacing w:before="40" w:after="80"/>
+        <w:jc w:val="both"/>
+      </w:pPr>
+      <w:r>
+        <w:rPr>
+          <w:rFonts w:ascii="Calibri" w:hAnsi="Calibri"/>
+          <w:b/>
+          <w:i w:val="0"/>
+          <w:color w:val="1A1A1A"/>
+          <w:sz w:val="20"/>
+        </w:rPr>
+        <w:t xml:space="preserve">USDPC conversion fee (if opted in only): </w:t>
+      </w:r>
+      <w:r>
+        <w:rPr>
+          <w:rFonts w:ascii="Calibri" w:hAnsi="Calibri"/>
+          <w:b w:val="0"/>
+          <w:i w:val="0"/>
+          <w:color w:val="1A1A1A"/>
+          <w:sz w:val="20"/>
+        </w:rPr>
+        <w:t>approximately 0.1% per automated USDT⇔USDPC sweep. Charged to the client’s account on each conversion.</w:t>
+      </w:r>
+    </w:p>
+    <w:p>
+      <w:pPr>
+        <w:spacing w:before="0" w:after="80"/>
+        <w:jc w:val="both"/>
+      </w:pPr>
+      <w:r>
+        <w:rPr>
+          <w:rFonts w:ascii="Calibri" w:hAnsi="Calibri"/>
+          <w:b w:val="0"/>
+          <w:i w:val="0"/>
+          <w:color w:val="1A1A1A"/>
+          <w:sz w:val="20"/>
+          <w:u w:val="none"/>
+        </w:rPr>
+        <w:t>No platform fee on contributions. No withdrawal fees (beyond exchange costs). No inactivity fees. Full fee transparency in the BitWealth client portal.</w:t>
       </w:r>
     </w:p>
     <w:p>
@@ -650,6 +954,22 @@
           <w:sz w:val="20"/>
         </w:rPr>
         <w:t>The Client authorises BitWealth to move funds between the Client’s ZAR (cash) wallet and Bitcoin wallet on VALR as required by the Strategy, within the limits of the Client’s funded balance.</w:t>
+      </w:r>
+    </w:p>
+    <w:p>
+      <w:pPr>
+        <w:pStyle w:val="ListBullet"/>
+        <w:spacing w:before="20" w:after="60"/>
+        <w:ind w:left="454"/>
+        <w:jc w:val="both"/>
+      </w:pPr>
+      <w:r>
+        <w:rPr>
+          <w:rFonts w:ascii="Calibri" w:hAnsi="Calibri"/>
+          <w:color w:val="1A1A1A"/>
+          <w:sz w:val="20"/>
+        </w:rPr>
+        <w:t>Where the Client has opted into Optional Component 4, the Client authorises BitWealth to automatically sweep idle USDT into USDPC and convert it back to USDT upon a buy signal, incurring the 0.1% conversion fee for the Client’s account. If the USDPC opt-in box above has NOT been initialled, this authorisation does not apply.</w:t>
       </w:r>
     </w:p>
     <w:p>

</xml_diff>